<commit_message>
Completed all 5 activities
</commit_message>
<xml_diff>
--- a/Activity/Activity-1.docx
+++ b/Activity/Activity-1.docx
@@ -4,843 +4,8 @@
   <w:body>
     <w:p>
       <w:pPr>
-        <w:rPr>
-          <w:b/>
-          <w:bCs/>
-        </w:rPr>
+        <w:pStyle w:val="NoSpacing"/>
       </w:pPr>
-      <w:r>
-        <w:rPr>
-          <w:b/>
-          <w:bCs/>
-        </w:rPr>
-        <w:t>Question 1 – Household Budget (Pie Chart)</w:t>
-      </w:r>
-    </w:p>
-    <w:p>
-      <w:r>
-        <w:t># Household Budget</w:t>
-      </w:r>
-    </w:p>
-    <w:p>
-      <w:r>
-        <w:t xml:space="preserve">category &lt;- </w:t>
-      </w:r>
-      <w:proofErr w:type="gramStart"/>
-      <w:r>
-        <w:t>c(</w:t>
-      </w:r>
-      <w:proofErr w:type="gramEnd"/>
-      <w:r>
-        <w:t>"Housing", "Transportation", "Food", "Entertainment")</w:t>
-      </w:r>
-    </w:p>
-    <w:p>
-      <w:r>
-        <w:t xml:space="preserve">percent &lt;- </w:t>
-      </w:r>
-      <w:proofErr w:type="gramStart"/>
-      <w:r>
-        <w:t>c(</w:t>
-      </w:r>
-      <w:proofErr w:type="gramEnd"/>
-      <w:r>
-        <w:t>40, 20, 30, 10)</w:t>
-      </w:r>
-    </w:p>
-    <w:p/>
-    <w:p>
-      <w:r>
-        <w:t># Pie Chart</w:t>
-      </w:r>
-    </w:p>
-    <w:p>
-      <w:proofErr w:type="gramStart"/>
-      <w:r>
-        <w:t>pie(</w:t>
-      </w:r>
-      <w:proofErr w:type="gramEnd"/>
-      <w:r>
-        <w:t>percent,</w:t>
-      </w:r>
-    </w:p>
-    <w:p>
-      <w:r>
-        <w:t xml:space="preserve">    labels = </w:t>
-      </w:r>
-      <w:proofErr w:type="gramStart"/>
-      <w:r>
-        <w:t>paste(</w:t>
-      </w:r>
-      <w:proofErr w:type="gramEnd"/>
-      <w:r>
-        <w:t>category, percent, "%"),</w:t>
-      </w:r>
-    </w:p>
-    <w:p>
-      <w:r>
-        <w:t xml:space="preserve">    col = </w:t>
-      </w:r>
-      <w:proofErr w:type="gramStart"/>
-      <w:r>
-        <w:t>rainbow(</w:t>
-      </w:r>
-      <w:proofErr w:type="gramEnd"/>
-      <w:r>
-        <w:t>4),</w:t>
-      </w:r>
-    </w:p>
-    <w:p>
-      <w:r>
-        <w:t xml:space="preserve">    main = "Household Budget Distribution")</w:t>
-      </w:r>
-    </w:p>
-    <w:p/>
-    <w:p>
-      <w:r>
-        <w:t># Weighted Average</w:t>
-      </w:r>
-    </w:p>
-    <w:p>
-      <w:r>
-        <w:t xml:space="preserve">weighted_avg &lt;- </w:t>
-      </w:r>
-      <w:proofErr w:type="gramStart"/>
-      <w:r>
-        <w:t>sum(</w:t>
-      </w:r>
-      <w:proofErr w:type="gramEnd"/>
-      <w:r>
-        <w:t>percent * (1:4)) / sum(percent)</w:t>
-      </w:r>
-    </w:p>
-    <w:p/>
-    <w:p>
-      <w:proofErr w:type="gramStart"/>
-      <w:r>
-        <w:t>cat(</w:t>
-      </w:r>
-      <w:proofErr w:type="gramEnd"/>
-      <w:r>
-        <w:t>"Weighted Average Category Value =", weighted_avg)</w:t>
-      </w:r>
-    </w:p>
-    <w:p>
-      <w:r>
-        <w:drawing>
-          <wp:inline distT="0" distB="0" distL="0" distR="0" wp14:anchorId="4F7A75EF" wp14:editId="0CC529E2">
-            <wp:extent cx="5731510" cy="3223895"/>
-            <wp:effectExtent l="0" t="0" r="2540" b="0"/>
-            <wp:docPr id="780129897" name="Picture 1"/>
-            <wp:cNvGraphicFramePr>
-              <a:graphicFrameLocks xmlns:a="http://schemas.openxmlformats.org/drawingml/2006/main" noChangeAspect="1"/>
-            </wp:cNvGraphicFramePr>
-            <a:graphic xmlns:a="http://schemas.openxmlformats.org/drawingml/2006/main">
-              <a:graphicData uri="http://schemas.openxmlformats.org/drawingml/2006/picture">
-                <pic:pic xmlns:pic="http://schemas.openxmlformats.org/drawingml/2006/picture">
-                  <pic:nvPicPr>
-                    <pic:cNvPr id="780129897" name=""/>
-                    <pic:cNvPicPr/>
-                  </pic:nvPicPr>
-                  <pic:blipFill>
-                    <a:blip r:embed="rId5"/>
-                    <a:stretch>
-                      <a:fillRect/>
-                    </a:stretch>
-                  </pic:blipFill>
-                  <pic:spPr>
-                    <a:xfrm>
-                      <a:off x="0" y="0"/>
-                      <a:ext cx="5731510" cy="3223895"/>
-                    </a:xfrm>
-                    <a:prstGeom prst="rect">
-                      <a:avLst/>
-                    </a:prstGeom>
-                  </pic:spPr>
-                </pic:pic>
-              </a:graphicData>
-            </a:graphic>
-          </wp:inline>
-        </w:drawing>
-      </w:r>
-    </w:p>
-    <w:p/>
-    <w:p/>
-    <w:p>
-      <w:pPr>
-        <w:rPr>
-          <w:b/>
-          <w:bCs/>
-        </w:rPr>
-      </w:pPr>
-      <w:r>
-        <w:rPr>
-          <w:b/>
-          <w:bCs/>
-        </w:rPr>
-        <w:lastRenderedPageBreak/>
-        <w:t>Question 2 – Student Grades (Bar Chart)</w:t>
-      </w:r>
-    </w:p>
-    <w:p>
-      <w:r>
-        <w:t># Grade Distribution</w:t>
-      </w:r>
-    </w:p>
-    <w:p>
-      <w:r>
-        <w:t xml:space="preserve">grades &lt;- </w:t>
-      </w:r>
-      <w:proofErr w:type="gramStart"/>
-      <w:r>
-        <w:t>c(</w:t>
-      </w:r>
-      <w:proofErr w:type="gramEnd"/>
-      <w:r>
-        <w:t>"A", "B", "C", "D", "E")</w:t>
-      </w:r>
-    </w:p>
-    <w:p>
-      <w:r>
-        <w:t xml:space="preserve">students &lt;- </w:t>
-      </w:r>
-      <w:proofErr w:type="gramStart"/>
-      <w:r>
-        <w:t>c(</w:t>
-      </w:r>
-      <w:proofErr w:type="gramEnd"/>
-      <w:r>
-        <w:t>6, 8, 9, 5, 2)</w:t>
-      </w:r>
-    </w:p>
-    <w:p/>
-    <w:p>
-      <w:r>
-        <w:t># Bar Chart</w:t>
-      </w:r>
-    </w:p>
-    <w:p>
-      <w:proofErr w:type="gramStart"/>
-      <w:r>
-        <w:t>barplot(</w:t>
-      </w:r>
-      <w:proofErr w:type="gramEnd"/>
-      <w:r>
-        <w:t>students,</w:t>
-      </w:r>
-    </w:p>
-    <w:p>
-      <w:r>
-        <w:t xml:space="preserve">        names.arg = grades,</w:t>
-      </w:r>
-    </w:p>
-    <w:p>
-      <w:r>
-        <w:t xml:space="preserve">        col = "lightblue",</w:t>
-      </w:r>
-    </w:p>
-    <w:p>
-      <w:r>
-        <w:t xml:space="preserve">        main = "Student Grade Distribution",</w:t>
-      </w:r>
-    </w:p>
-    <w:p>
-      <w:r>
-        <w:t xml:space="preserve">        xlab = "Grades",</w:t>
-      </w:r>
-    </w:p>
-    <w:p>
-      <w:r>
-        <w:t xml:space="preserve">        ylab = "Number of Students")</w:t>
-      </w:r>
-    </w:p>
-    <w:p/>
-    <w:p>
-      <w:r>
-        <w:t># Midpoint Scores</w:t>
-      </w:r>
-    </w:p>
-    <w:p>
-      <w:r>
-        <w:t xml:space="preserve">score &lt;- </w:t>
-      </w:r>
-      <w:proofErr w:type="gramStart"/>
-      <w:r>
-        <w:t>c(</w:t>
-      </w:r>
-      <w:proofErr w:type="gramEnd"/>
-      <w:r>
-        <w:t>95, 85, 75, 65, 50)</w:t>
-      </w:r>
-    </w:p>
-    <w:p/>
-    <w:p>
-      <w:r>
-        <w:t># Average Score</w:t>
-      </w:r>
-    </w:p>
-    <w:p>
-      <w:r>
-        <w:t xml:space="preserve">average &lt;- </w:t>
-      </w:r>
-      <w:proofErr w:type="gramStart"/>
-      <w:r>
-        <w:t>sum(</w:t>
-      </w:r>
-      <w:proofErr w:type="gramEnd"/>
-      <w:r>
-        <w:t>score * students) / sum(students)</w:t>
-      </w:r>
-    </w:p>
-    <w:p/>
-    <w:p>
-      <w:proofErr w:type="gramStart"/>
-      <w:r>
-        <w:t>cat(</w:t>
-      </w:r>
-      <w:proofErr w:type="gramEnd"/>
-      <w:r>
-        <w:t>"Average Score =", average)</w:t>
-      </w:r>
-    </w:p>
-    <w:p>
-      <w:r>
-        <w:lastRenderedPageBreak/>
-        <w:drawing>
-          <wp:inline distT="0" distB="0" distL="0" distR="0" wp14:anchorId="39D15256" wp14:editId="3A5D9CBB">
-            <wp:extent cx="5731510" cy="3223895"/>
-            <wp:effectExtent l="0" t="0" r="2540" b="0"/>
-            <wp:docPr id="1059276142" name="Picture 1"/>
-            <wp:cNvGraphicFramePr>
-              <a:graphicFrameLocks xmlns:a="http://schemas.openxmlformats.org/drawingml/2006/main" noChangeAspect="1"/>
-            </wp:cNvGraphicFramePr>
-            <a:graphic xmlns:a="http://schemas.openxmlformats.org/drawingml/2006/main">
-              <a:graphicData uri="http://schemas.openxmlformats.org/drawingml/2006/picture">
-                <pic:pic xmlns:pic="http://schemas.openxmlformats.org/drawingml/2006/picture">
-                  <pic:nvPicPr>
-                    <pic:cNvPr id="1059276142" name=""/>
-                    <pic:cNvPicPr/>
-                  </pic:nvPicPr>
-                  <pic:blipFill>
-                    <a:blip r:embed="rId6"/>
-                    <a:stretch>
-                      <a:fillRect/>
-                    </a:stretch>
-                  </pic:blipFill>
-                  <pic:spPr>
-                    <a:xfrm>
-                      <a:off x="0" y="0"/>
-                      <a:ext cx="5731510" cy="3223895"/>
-                    </a:xfrm>
-                    <a:prstGeom prst="rect">
-                      <a:avLst/>
-                    </a:prstGeom>
-                  </pic:spPr>
-                </pic:pic>
-              </a:graphicData>
-            </a:graphic>
-          </wp:inline>
-        </w:drawing>
-      </w:r>
-    </w:p>
-    <w:p/>
-    <w:p>
-      <w:pPr>
-        <w:rPr>
-          <w:b/>
-          <w:bCs/>
-        </w:rPr>
-      </w:pPr>
-      <w:r>
-        <w:rPr>
-          <w:b/>
-          <w:bCs/>
-        </w:rPr>
-        <w:t>Question 3 – Favourite Fruit (Bar Chart)</w:t>
-      </w:r>
-    </w:p>
-    <w:p>
-      <w:r>
-        <w:t># Favourite Fruits</w:t>
-      </w:r>
-    </w:p>
-    <w:p>
-      <w:r>
-        <w:t xml:space="preserve">fruit &lt;- </w:t>
-      </w:r>
-      <w:proofErr w:type="gramStart"/>
-      <w:r>
-        <w:t>c(</w:t>
-      </w:r>
-      <w:proofErr w:type="gramEnd"/>
-      <w:r>
-        <w:t>"Apple", "Banana", "Mango", "Orange", "Grapes")</w:t>
-      </w:r>
-    </w:p>
-    <w:p>
-      <w:r>
-        <w:t xml:space="preserve">votes &lt;- </w:t>
-      </w:r>
-      <w:proofErr w:type="gramStart"/>
-      <w:r>
-        <w:t>c(</w:t>
-      </w:r>
-      <w:proofErr w:type="gramEnd"/>
-      <w:r>
-        <w:t>40, 35, 60, 25, 20)</w:t>
-      </w:r>
-    </w:p>
-    <w:p/>
-    <w:p>
-      <w:r>
-        <w:t># Bar Chart</w:t>
-      </w:r>
-    </w:p>
-    <w:p>
-      <w:proofErr w:type="gramStart"/>
-      <w:r>
-        <w:t>barplot(</w:t>
-      </w:r>
-      <w:proofErr w:type="gramEnd"/>
-      <w:r>
-        <w:t>votes,</w:t>
-      </w:r>
-    </w:p>
-    <w:p>
-      <w:r>
-        <w:t xml:space="preserve">        names.arg = fruit,</w:t>
-      </w:r>
-    </w:p>
-    <w:p>
-      <w:r>
-        <w:t xml:space="preserve">        col = "orange",</w:t>
-      </w:r>
-    </w:p>
-    <w:p>
-      <w:r>
-        <w:t xml:space="preserve">        main = "Favourite Fruit Survey",</w:t>
-      </w:r>
-    </w:p>
-    <w:p>
-      <w:r>
-        <w:t xml:space="preserve">        xlab = "Fruit",</w:t>
-      </w:r>
-    </w:p>
-    <w:p>
-      <w:r>
-        <w:t xml:space="preserve">        ylab = "Number of Votes")</w:t>
-      </w:r>
-    </w:p>
-    <w:p/>
-    <w:p>
-      <w:proofErr w:type="gramStart"/>
-      <w:r>
-        <w:t>cat(</w:t>
-      </w:r>
-      <w:proofErr w:type="gramEnd"/>
-      <w:r>
-        <w:t>"Most Preferred Fruit:", fruit[which.max(votes)], "\n")</w:t>
-      </w:r>
-    </w:p>
-    <w:p>
-      <w:proofErr w:type="gramStart"/>
-      <w:r>
-        <w:t>cat(</w:t>
-      </w:r>
-      <w:proofErr w:type="gramEnd"/>
-      <w:r>
-        <w:t>"Least Preferred Fruit:", fruit[which.min(votes)], "\n")</w:t>
-      </w:r>
-    </w:p>
-    <w:p>
-      <w:r>
-        <w:lastRenderedPageBreak/>
-        <w:drawing>
-          <wp:inline distT="0" distB="0" distL="0" distR="0" wp14:anchorId="31117A0E" wp14:editId="68EA4072">
-            <wp:extent cx="5731510" cy="3223895"/>
-            <wp:effectExtent l="0" t="0" r="2540" b="0"/>
-            <wp:docPr id="864899082" name="Picture 1"/>
-            <wp:cNvGraphicFramePr>
-              <a:graphicFrameLocks xmlns:a="http://schemas.openxmlformats.org/drawingml/2006/main" noChangeAspect="1"/>
-            </wp:cNvGraphicFramePr>
-            <a:graphic xmlns:a="http://schemas.openxmlformats.org/drawingml/2006/main">
-              <a:graphicData uri="http://schemas.openxmlformats.org/drawingml/2006/picture">
-                <pic:pic xmlns:pic="http://schemas.openxmlformats.org/drawingml/2006/picture">
-                  <pic:nvPicPr>
-                    <pic:cNvPr id="864899082" name=""/>
-                    <pic:cNvPicPr/>
-                  </pic:nvPicPr>
-                  <pic:blipFill>
-                    <a:blip r:embed="rId7"/>
-                    <a:stretch>
-                      <a:fillRect/>
-                    </a:stretch>
-                  </pic:blipFill>
-                  <pic:spPr>
-                    <a:xfrm>
-                      <a:off x="0" y="0"/>
-                      <a:ext cx="5731510" cy="3223895"/>
-                    </a:xfrm>
-                    <a:prstGeom prst="rect">
-                      <a:avLst/>
-                    </a:prstGeom>
-                  </pic:spPr>
-                </pic:pic>
-              </a:graphicData>
-            </a:graphic>
-          </wp:inline>
-        </w:drawing>
-      </w:r>
-    </w:p>
-    <w:p/>
-    <w:p>
-      <w:pPr>
-        <w:rPr>
-          <w:b/>
-          <w:bCs/>
-        </w:rPr>
-      </w:pPr>
-      <w:r>
-        <w:rPr>
-          <w:b/>
-          <w:bCs/>
-        </w:rPr>
-        <w:t>Question 4 – Employees by Department (Pie Chart)</w:t>
-      </w:r>
-    </w:p>
-    <w:p>
-      <w:r>
-        <w:t># Department Distribution</w:t>
-      </w:r>
-    </w:p>
-    <w:p>
-      <w:r>
-        <w:t xml:space="preserve">department &lt;- </w:t>
-      </w:r>
-      <w:proofErr w:type="gramStart"/>
-      <w:r>
-        <w:t>c(</w:t>
-      </w:r>
-      <w:proofErr w:type="gramEnd"/>
-      <w:r>
-        <w:t>"Marketing", "HR", "Finance", "IT", "Operations")</w:t>
-      </w:r>
-    </w:p>
-    <w:p>
-      <w:r>
-        <w:t xml:space="preserve">percent &lt;- </w:t>
-      </w:r>
-      <w:proofErr w:type="gramStart"/>
-      <w:r>
-        <w:t>c(</w:t>
-      </w:r>
-      <w:proofErr w:type="gramEnd"/>
-      <w:r>
-        <w:t>25, 15, 20, 25, 15)</w:t>
-      </w:r>
-    </w:p>
-    <w:p/>
-    <w:p>
-      <w:r>
-        <w:t># Pie Chart</w:t>
-      </w:r>
-    </w:p>
-    <w:p>
-      <w:proofErr w:type="gramStart"/>
-      <w:r>
-        <w:t>pie(</w:t>
-      </w:r>
-      <w:proofErr w:type="gramEnd"/>
-      <w:r>
-        <w:t>percent,</w:t>
-      </w:r>
-    </w:p>
-    <w:p>
-      <w:r>
-        <w:t xml:space="preserve">    labels = </w:t>
-      </w:r>
-      <w:proofErr w:type="gramStart"/>
-      <w:r>
-        <w:t>paste(</w:t>
-      </w:r>
-      <w:proofErr w:type="gramEnd"/>
-      <w:r>
-        <w:t>department, percent, "%"),</w:t>
-      </w:r>
-    </w:p>
-    <w:p>
-      <w:r>
-        <w:t xml:space="preserve">    col = </w:t>
-      </w:r>
-      <w:proofErr w:type="gramStart"/>
-      <w:r>
-        <w:t>rainbow(</w:t>
-      </w:r>
-      <w:proofErr w:type="gramEnd"/>
-      <w:r>
-        <w:t>5),</w:t>
-      </w:r>
-    </w:p>
-    <w:p>
-      <w:r>
-        <w:t xml:space="preserve">    main = "Employee Department Distribution")</w:t>
-      </w:r>
-    </w:p>
-    <w:p/>
-    <w:p>
-      <w:r>
-        <w:t># Employees in Marketing</w:t>
-      </w:r>
-    </w:p>
-    <w:p>
-      <w:r>
-        <w:t>total_employees &lt;- 200</w:t>
-      </w:r>
-    </w:p>
-    <w:p>
-      <w:r>
-        <w:t>marketing &lt;- total_employees * 25 / 100</w:t>
-      </w:r>
-    </w:p>
-    <w:p/>
-    <w:p>
-      <w:proofErr w:type="gramStart"/>
-      <w:r>
-        <w:t>cat(</w:t>
-      </w:r>
-      <w:proofErr w:type="gramEnd"/>
-      <w:r>
-        <w:t>"Employees in Marketing =", marketing)</w:t>
-      </w:r>
-    </w:p>
-    <w:p>
-      <w:r>
-        <w:lastRenderedPageBreak/>
-        <w:drawing>
-          <wp:inline distT="0" distB="0" distL="0" distR="0" wp14:anchorId="0CC6949F" wp14:editId="21FF3296">
-            <wp:extent cx="5731510" cy="3223895"/>
-            <wp:effectExtent l="0" t="0" r="2540" b="0"/>
-            <wp:docPr id="819054760" name="Picture 1"/>
-            <wp:cNvGraphicFramePr>
-              <a:graphicFrameLocks xmlns:a="http://schemas.openxmlformats.org/drawingml/2006/main" noChangeAspect="1"/>
-            </wp:cNvGraphicFramePr>
-            <a:graphic xmlns:a="http://schemas.openxmlformats.org/drawingml/2006/main">
-              <a:graphicData uri="http://schemas.openxmlformats.org/drawingml/2006/picture">
-                <pic:pic xmlns:pic="http://schemas.openxmlformats.org/drawingml/2006/picture">
-                  <pic:nvPicPr>
-                    <pic:cNvPr id="819054760" name=""/>
-                    <pic:cNvPicPr/>
-                  </pic:nvPicPr>
-                  <pic:blipFill>
-                    <a:blip r:embed="rId8"/>
-                    <a:stretch>
-                      <a:fillRect/>
-                    </a:stretch>
-                  </pic:blipFill>
-                  <pic:spPr>
-                    <a:xfrm>
-                      <a:off x="0" y="0"/>
-                      <a:ext cx="5731510" cy="3223895"/>
-                    </a:xfrm>
-                    <a:prstGeom prst="rect">
-                      <a:avLst/>
-                    </a:prstGeom>
-                  </pic:spPr>
-                </pic:pic>
-              </a:graphicData>
-            </a:graphic>
-          </wp:inline>
-        </w:drawing>
-      </w:r>
-    </w:p>
-    <w:p/>
-    <w:p>
-      <w:pPr>
-        <w:rPr>
-          <w:b/>
-          <w:bCs/>
-        </w:rPr>
-      </w:pPr>
-      <w:r>
-        <w:rPr>
-          <w:b/>
-          <w:bCs/>
-        </w:rPr>
-        <w:t>Question 5 – Weekend Activities (Pie Chart)</w:t>
-      </w:r>
-    </w:p>
-    <w:p>
-      <w:r>
-        <w:t># Weekend Activities</w:t>
-      </w:r>
-    </w:p>
-    <w:p>
-      <w:r>
-        <w:t xml:space="preserve">activity &lt;- </w:t>
-      </w:r>
-      <w:proofErr w:type="gramStart"/>
-      <w:r>
-        <w:t>c(</w:t>
-      </w:r>
-      <w:proofErr w:type="gramEnd"/>
-      <w:r>
-        <w:t>"Video Games",</w:t>
-      </w:r>
-    </w:p>
-    <w:p>
-      <w:r>
-        <w:t xml:space="preserve">              "Reading",</w:t>
-      </w:r>
-    </w:p>
-    <w:p>
-      <w:r>
-        <w:t xml:space="preserve">              "Cooking",</w:t>
-      </w:r>
-    </w:p>
-    <w:p>
-      <w:r>
-        <w:t xml:space="preserve">              "Painting",</w:t>
-      </w:r>
-    </w:p>
-    <w:p>
-      <w:r>
-        <w:t xml:space="preserve">              "Music")</w:t>
-      </w:r>
-    </w:p>
-    <w:p/>
-    <w:p>
-      <w:r>
-        <w:t xml:space="preserve">percent &lt;- </w:t>
-      </w:r>
-      <w:proofErr w:type="gramStart"/>
-      <w:r>
-        <w:t>c(</w:t>
-      </w:r>
-      <w:proofErr w:type="gramEnd"/>
-      <w:r>
-        <w:t>20, 35, 20, 10, 25)</w:t>
-      </w:r>
-    </w:p>
-    <w:p/>
-    <w:p>
-      <w:r>
-        <w:t># Pie Chart</w:t>
-      </w:r>
-    </w:p>
-    <w:p>
-      <w:proofErr w:type="gramStart"/>
-      <w:r>
-        <w:t>pie(</w:t>
-      </w:r>
-      <w:proofErr w:type="gramEnd"/>
-      <w:r>
-        <w:t>percent,</w:t>
-      </w:r>
-    </w:p>
-    <w:p>
-      <w:r>
-        <w:t xml:space="preserve">    labels = </w:t>
-      </w:r>
-      <w:proofErr w:type="gramStart"/>
-      <w:r>
-        <w:t>paste(</w:t>
-      </w:r>
-      <w:proofErr w:type="gramEnd"/>
-      <w:r>
-        <w:t>activity, percent, "%"),</w:t>
-      </w:r>
-    </w:p>
-    <w:p>
-      <w:r>
-        <w:t xml:space="preserve">    col = </w:t>
-      </w:r>
-      <w:proofErr w:type="gramStart"/>
-      <w:r>
-        <w:t>rainbow(</w:t>
-      </w:r>
-      <w:proofErr w:type="gramEnd"/>
-      <w:r>
-        <w:t>5),</w:t>
-      </w:r>
-    </w:p>
-    <w:p>
-      <w:r>
-        <w:t xml:space="preserve">    main = "Weekend Activities of Employees")</w:t>
-      </w:r>
-    </w:p>
-    <w:p/>
-    <w:p>
-      <w:proofErr w:type="gramStart"/>
-      <w:r>
-        <w:lastRenderedPageBreak/>
-        <w:t>cat(</w:t>
-      </w:r>
-      <w:proofErr w:type="gramEnd"/>
-      <w:r>
-        <w:t>"Most Common Activity:",</w:t>
-      </w:r>
-    </w:p>
-    <w:p>
-      <w:pPr>
-        <w:rPr>
-          <w:noProof/>
-        </w:rPr>
-      </w:pPr>
-      <w:r>
-        <w:t xml:space="preserve">    activity[which.max(percent)])</w:t>
-      </w:r>
-      <w:r>
-        <w:rPr>
-          <w:noProof/>
-        </w:rPr>
-        <w:t xml:space="preserve"> </w:t>
-      </w:r>
-    </w:p>
-    <w:p>
-      <w:pPr>
-        <w:rPr>
-          <w:noProof/>
-        </w:rPr>
-      </w:pPr>
-    </w:p>
-    <w:p>
-      <w:r>
-        <w:drawing>
-          <wp:inline distT="0" distB="0" distL="0" distR="0" wp14:anchorId="0459637D" wp14:editId="4E1B6233">
-            <wp:extent cx="5731510" cy="3223895"/>
-            <wp:effectExtent l="0" t="0" r="2540" b="0"/>
-            <wp:docPr id="344605131" name="Picture 1"/>
-            <wp:cNvGraphicFramePr>
-              <a:graphicFrameLocks xmlns:a="http://schemas.openxmlformats.org/drawingml/2006/main" noChangeAspect="1"/>
-            </wp:cNvGraphicFramePr>
-            <a:graphic xmlns:a="http://schemas.openxmlformats.org/drawingml/2006/main">
-              <a:graphicData uri="http://schemas.openxmlformats.org/drawingml/2006/picture">
-                <pic:pic xmlns:pic="http://schemas.openxmlformats.org/drawingml/2006/picture">
-                  <pic:nvPicPr>
-                    <pic:cNvPr id="344605131" name=""/>
-                    <pic:cNvPicPr/>
-                  </pic:nvPicPr>
-                  <pic:blipFill>
-                    <a:blip r:embed="rId9"/>
-                    <a:stretch>
-                      <a:fillRect/>
-                    </a:stretch>
-                  </pic:blipFill>
-                  <pic:spPr>
-                    <a:xfrm>
-                      <a:off x="0" y="0"/>
-                      <a:ext cx="5731510" cy="3223895"/>
-                    </a:xfrm>
-                    <a:prstGeom prst="rect">
-                      <a:avLst/>
-                    </a:prstGeom>
-                  </pic:spPr>
-                </pic:pic>
-              </a:graphicData>
-            </a:graphic>
-          </wp:inline>
-        </w:drawing>
-      </w:r>
     </w:p>
     <w:sectPr>
       <w:pgSz w:w="11906" w:h="16838"/>
@@ -1768,6 +933,15 @@
       <w:spacing w:val="5"/>
     </w:rPr>
   </w:style>
+  <w:style w:type="paragraph" w:styleId="NoSpacing">
+    <w:name w:val="No Spacing"/>
+    <w:uiPriority w:val="1"/>
+    <w:qFormat/>
+    <w:rsid w:val="00B67D0E"/>
+    <w:pPr>
+      <w:spacing w:after="0" w:line="240" w:lineRule="auto"/>
+    </w:pPr>
+  </w:style>
 </w:styles>
 </file>
 

</xml_diff>